<commit_message>
docs: update testing report evidence
</commit_message>
<xml_diff>
--- a/BAB_III_dan_BAB_IV_Pengujian_Sistem_Rekomendasi_Zaldi_Lengkap_REVISI.docx
+++ b/BAB_III_dan_BAB_IV_Pengujian_Sistem_Rekomendasi_Zaldi_Lengkap_REVISI.docx
@@ -7092,11 +7092,10 @@
       </w:pPr>
       <w:r>
         <w:rPr>
-          <w:rFonts w:ascii="Times New Roman" w:hAnsi="Times New Roman" w:eastAsia="Times New Roman"/>
-          <w:b w:val="0"/>
-          <w:sz w:val="22"/>
+          <w:rFonts w:ascii="Times New Roman" w:hAnsi="Times New Roman"/>
+          <w:sz w:val="24"/>
         </w:rPr>
-        <w:t>Skenario BB-01 sampai BB-14 telah disusun dari implementasi aktual. Hasil lulus/gagal hanya boleh diisi setelah aplikasi dijalankan dengan basis data uji, session, dan (untuk BB-14) Midtrans sandbox. Inspeksi source code tidak digolongkan sebagai black-box lulus.</w:t>
+        <w:t>Tabel berikut digunakan sebagai rekap status pengujian black-box dan integrasi. Kolom isian diisi setelah setiap skenario dijalankan dengan mencantumkan bukti aktual, seperti screenshot, request/response, data uji, atau log sistem.</w:t>
       </w:r>
     </w:p>
     <w:p>
@@ -7115,77 +7114,114 @@
     <w:tbl>
       <w:tblPr>
         <w:tblStyle w:val="TableGrid"/>
-        <w:tblW w:type="auto" w:w="0"/>
+        <w:tblW w:type="dxa" w:w="9240"/>
+        <w:tblLayout w:type="fixed"/>
         <w:tblLook w:firstColumn="1" w:firstRow="1" w:lastColumn="0" w:lastRow="0" w:noHBand="0" w:noVBand="1" w:val="04A0"/>
+        <w:tblBorders>
+          <w:top w:val="single" w:sz="6" w:space="0" w:color="808080"/>
+          <w:left w:val="single" w:sz="6" w:space="0" w:color="808080"/>
+          <w:bottom w:val="single" w:sz="6" w:space="0" w:color="808080"/>
+          <w:right w:val="single" w:sz="6" w:space="0" w:color="808080"/>
+          <w:insideH w:val="single" w:sz="6" w:space="0" w:color="808080"/>
+          <w:insideV w:val="single" w:sz="6" w:space="0" w:color="808080"/>
+        </w:tblBorders>
+        <w:tblInd w:w="120" w:type="dxa"/>
       </w:tblPr>
       <w:tblGrid>
-        <w:gridCol w:w="2068"/>
-        <w:gridCol w:w="2068"/>
-        <w:gridCol w:w="2068"/>
-        <w:gridCol w:w="2068"/>
+        <w:gridCol w:w="1700"/>
+        <w:gridCol w:w="1200"/>
+        <w:gridCol w:w="1900"/>
+        <w:gridCol w:w="4440"/>
       </w:tblGrid>
       <w:tr>
-        <w:tc>
-          <w:tcPr>
-            <w:tcW w:type="dxa" w:w="2068"/>
-          </w:tcPr>
-          <w:p>
-            <w:r/>
-            <w:r>
-              <w:rPr>
-                <w:rFonts w:ascii="Times New Roman" w:hAnsi="Times New Roman" w:eastAsia="Times New Roman"/>
+        <w:trPr>
+          <w:tblHeader w:val="true"/>
+        </w:trPr>
+        <w:tc>
+          <w:tcPr>
+            <w:tcW w:type="dxa" w:w="1700"/>
+            <w:vAlign w:val="center"/>
+            <w:shd w:fill="D9EAF7"/>
+          </w:tcPr>
+          <w:p>
+            <w:pPr>
+              <w:spacing w:after="40" w:line="252" w:lineRule="auto"/>
+              <w:jc w:val="center"/>
+            </w:pPr>
+            <w:r/>
+            <w:r>
+              <w:rPr>
+                <w:rFonts w:ascii="Times New Roman" w:hAnsi="Times New Roman"/>
                 <w:b/>
                 <w:sz w:val="20"/>
               </w:rPr>
-              <w:t>Kelompok</w:t>
-            </w:r>
-          </w:p>
-        </w:tc>
-        <w:tc>
-          <w:tcPr>
-            <w:tcW w:type="dxa" w:w="2068"/>
-          </w:tcPr>
-          <w:p>
-            <w:r/>
-            <w:r>
-              <w:rPr>
-                <w:rFonts w:ascii="Times New Roman" w:hAnsi="Times New Roman" w:eastAsia="Times New Roman"/>
+              <w:t>Kelompok Pengujian</w:t>
+            </w:r>
+          </w:p>
+        </w:tc>
+        <w:tc>
+          <w:tcPr>
+            <w:tcW w:type="dxa" w:w="1200"/>
+            <w:vAlign w:val="center"/>
+            <w:shd w:fill="D9EAF7"/>
+          </w:tcPr>
+          <w:p>
+            <w:pPr>
+              <w:spacing w:after="40" w:line="252" w:lineRule="auto"/>
+              <w:jc w:val="center"/>
+            </w:pPr>
+            <w:r/>
+            <w:r>
+              <w:rPr>
+                <w:rFonts w:ascii="Times New Roman" w:hAnsi="Times New Roman"/>
                 <w:b/>
                 <w:sz w:val="20"/>
               </w:rPr>
-              <w:t>ID</w:t>
-            </w:r>
-          </w:p>
-        </w:tc>
-        <w:tc>
-          <w:tcPr>
-            <w:tcW w:type="dxa" w:w="2068"/>
-          </w:tcPr>
-          <w:p>
-            <w:r/>
-            <w:r>
-              <w:rPr>
-                <w:rFonts w:ascii="Times New Roman" w:hAnsi="Times New Roman" w:eastAsia="Times New Roman"/>
+              <w:t>ID Skenario</w:t>
+            </w:r>
+          </w:p>
+        </w:tc>
+        <w:tc>
+          <w:tcPr>
+            <w:tcW w:type="dxa" w:w="1900"/>
+            <w:vAlign w:val="center"/>
+            <w:shd w:fill="D9EAF7"/>
+          </w:tcPr>
+          <w:p>
+            <w:pPr>
+              <w:spacing w:after="40" w:line="252" w:lineRule="auto"/>
+              <w:jc w:val="center"/>
+            </w:pPr>
+            <w:r/>
+            <w:r>
+              <w:rPr>
+                <w:rFonts w:ascii="Times New Roman" w:hAnsi="Times New Roman"/>
                 <w:b/>
                 <w:sz w:val="20"/>
               </w:rPr>
-              <w:t>Status saat ini</w:t>
-            </w:r>
-          </w:p>
-        </w:tc>
-        <w:tc>
-          <w:tcPr>
-            <w:tcW w:type="dxa" w:w="2068"/>
-          </w:tcPr>
-          <w:p>
-            <w:r/>
-            <w:r>
-              <w:rPr>
-                <w:rFonts w:ascii="Times New Roman" w:hAnsi="Times New Roman" w:eastAsia="Times New Roman"/>
+              <w:t>Status Saat Ini</w:t>
+            </w:r>
+          </w:p>
+        </w:tc>
+        <w:tc>
+          <w:tcPr>
+            <w:tcW w:type="dxa" w:w="4440"/>
+            <w:vAlign w:val="center"/>
+            <w:shd w:fill="D9EAF7"/>
+          </w:tcPr>
+          <w:p>
+            <w:pPr>
+              <w:spacing w:after="40" w:line="252" w:lineRule="auto"/>
+              <w:jc w:val="center"/>
+            </w:pPr>
+            <w:r/>
+            <w:r>
+              <w:rPr>
+                <w:rFonts w:ascii="Times New Roman" w:hAnsi="Times New Roman"/>
                 <w:b/>
                 <w:sz w:val="20"/>
               </w:rPr>
-              <w:t>Bukti yang diperlukan</w:t>
+              <w:t>Isian/Bukti yang Dilengkapi</w:t>
             </w:r>
           </w:p>
         </w:tc>
@@ -7193,13 +7229,18 @@
       <w:tr>
         <w:tc>
           <w:tcPr>
-            <w:tcW w:type="dxa" w:w="2068"/>
-          </w:tcPr>
-          <w:p>
-            <w:r/>
-            <w:r>
-              <w:rPr>
-                <w:rFonts w:ascii="Times New Roman" w:hAnsi="Times New Roman" w:eastAsia="Times New Roman"/>
+            <w:tcW w:type="dxa" w:w="1700"/>
+            <w:vAlign w:val="center"/>
+          </w:tcPr>
+          <w:p>
+            <w:pPr>
+              <w:spacing w:after="40" w:line="252" w:lineRule="auto"/>
+              <w:jc w:val="left"/>
+            </w:pPr>
+            <w:r/>
+            <w:r>
+              <w:rPr>
+                <w:rFonts w:ascii="Times New Roman" w:hAnsi="Times New Roman"/>
                 <w:b w:val="0"/>
                 <w:sz w:val="20"/>
               </w:rPr>
@@ -7209,49 +7250,64 @@
         </w:tc>
         <w:tc>
           <w:tcPr>
-            <w:tcW w:type="dxa" w:w="2068"/>
-          </w:tcPr>
-          <w:p>
-            <w:r/>
-            <w:r>
-              <w:rPr>
-                <w:rFonts w:ascii="Times New Roman" w:hAnsi="Times New Roman" w:eastAsia="Times New Roman"/>
+            <w:tcW w:type="dxa" w:w="1200"/>
+            <w:vAlign w:val="center"/>
+          </w:tcPr>
+          <w:p>
+            <w:pPr>
+              <w:spacing w:after="40" w:line="252" w:lineRule="auto"/>
+              <w:jc w:val="left"/>
+            </w:pPr>
+            <w:r/>
+            <w:r>
+              <w:rPr>
+                <w:rFonts w:ascii="Times New Roman" w:hAnsi="Times New Roman"/>
                 <w:b w:val="0"/>
                 <w:sz w:val="20"/>
               </w:rPr>
-              <w:t>BB-01–BB-02</w:t>
-            </w:r>
-          </w:p>
-        </w:tc>
-        <w:tc>
-          <w:tcPr>
-            <w:tcW w:type="dxa" w:w="2068"/>
-          </w:tcPr>
-          <w:p>
-            <w:r/>
-            <w:r>
-              <w:rPr>
-                <w:rFonts w:ascii="Times New Roman" w:hAnsi="Times New Roman" w:eastAsia="Times New Roman"/>
+              <w:t>BB-01-BB-02</w:t>
+            </w:r>
+          </w:p>
+        </w:tc>
+        <w:tc>
+          <w:tcPr>
+            <w:tcW w:type="dxa" w:w="1900"/>
+            <w:vAlign w:val="center"/>
+          </w:tcPr>
+          <w:p>
+            <w:pPr>
+              <w:spacing w:after="40" w:line="252" w:lineRule="auto"/>
+              <w:jc w:val="left"/>
+            </w:pPr>
+            <w:r/>
+            <w:r>
+              <w:rPr>
+                <w:rFonts w:ascii="Times New Roman" w:hAnsi="Times New Roman"/>
                 <w:b w:val="0"/>
                 <w:sz w:val="20"/>
               </w:rPr>
-              <w:t>Belum dijalankan</w:t>
-            </w:r>
-          </w:p>
-        </w:tc>
-        <w:tc>
-          <w:tcPr>
-            <w:tcW w:type="dxa" w:w="2068"/>
-          </w:tcPr>
-          <w:p>
-            <w:r/>
-            <w:r>
-              <w:rPr>
-                <w:rFonts w:ascii="Times New Roman" w:hAnsi="Times New Roman" w:eastAsia="Times New Roman"/>
+              <w:t>Sebagian telah diuji secara terbatas</w:t>
+            </w:r>
+          </w:p>
+        </w:tc>
+        <w:tc>
+          <w:tcPr>
+            <w:tcW w:type="dxa" w:w="4440"/>
+            <w:vAlign w:val="center"/>
+          </w:tcPr>
+          <w:p>
+            <w:pPr>
+              <w:spacing w:after="40" w:line="252" w:lineRule="auto"/>
+              <w:jc w:val="left"/>
+            </w:pPr>
+            <w:r/>
+            <w:r>
+              <w:rPr>
+                <w:rFonts w:ascii="Times New Roman" w:hAnsi="Times New Roman"/>
                 <w:b w:val="0"/>
                 <w:sz w:val="20"/>
               </w:rPr>
-              <w:t>Request/response guest, pelanggan, admin, akun nonaktif</w:t>
+              <w:t>Isi bukti final: request/response atau screenshot akses guest, pelanggan, admin, dan akun nonaktif. Catat tanggal, akun uji, URL, hasil aktual, dan status akhir.</w:t>
             </w:r>
           </w:p>
         </w:tc>
@@ -7259,13 +7315,18 @@
       <w:tr>
         <w:tc>
           <w:tcPr>
-            <w:tcW w:type="dxa" w:w="2068"/>
-          </w:tcPr>
-          <w:p>
-            <w:r/>
-            <w:r>
-              <w:rPr>
-                <w:rFonts w:ascii="Times New Roman" w:hAnsi="Times New Roman" w:eastAsia="Times New Roman"/>
+            <w:tcW w:type="dxa" w:w="1700"/>
+            <w:vAlign w:val="center"/>
+          </w:tcPr>
+          <w:p>
+            <w:pPr>
+              <w:spacing w:after="40" w:line="252" w:lineRule="auto"/>
+              <w:jc w:val="left"/>
+            </w:pPr>
+            <w:r/>
+            <w:r>
+              <w:rPr>
+                <w:rFonts w:ascii="Times New Roman" w:hAnsi="Times New Roman"/>
                 <w:b w:val="0"/>
                 <w:sz w:val="20"/>
               </w:rPr>
@@ -7275,49 +7336,64 @@
         </w:tc>
         <w:tc>
           <w:tcPr>
-            <w:tcW w:type="dxa" w:w="2068"/>
-          </w:tcPr>
-          <w:p>
-            <w:r/>
-            <w:r>
-              <w:rPr>
-                <w:rFonts w:ascii="Times New Roman" w:hAnsi="Times New Roman" w:eastAsia="Times New Roman"/>
+            <w:tcW w:type="dxa" w:w="1200"/>
+            <w:vAlign w:val="center"/>
+          </w:tcPr>
+          <w:p>
+            <w:pPr>
+              <w:spacing w:after="40" w:line="252" w:lineRule="auto"/>
+              <w:jc w:val="left"/>
+            </w:pPr>
+            <w:r/>
+            <w:r>
+              <w:rPr>
+                <w:rFonts w:ascii="Times New Roman" w:hAnsi="Times New Roman"/>
                 <w:b w:val="0"/>
                 <w:sz w:val="20"/>
               </w:rPr>
-              <w:t>BB-03–BB-04</w:t>
-            </w:r>
-          </w:p>
-        </w:tc>
-        <w:tc>
-          <w:tcPr>
-            <w:tcW w:type="dxa" w:w="2068"/>
-          </w:tcPr>
-          <w:p>
-            <w:r/>
-            <w:r>
-              <w:rPr>
-                <w:rFonts w:ascii="Times New Roman" w:hAnsi="Times New Roman" w:eastAsia="Times New Roman"/>
+              <w:t>BB-03-BB-04</w:t>
+            </w:r>
+          </w:p>
+        </w:tc>
+        <w:tc>
+          <w:tcPr>
+            <w:tcW w:type="dxa" w:w="1900"/>
+            <w:vAlign w:val="center"/>
+          </w:tcPr>
+          <w:p>
+            <w:pPr>
+              <w:spacing w:after="40" w:line="252" w:lineRule="auto"/>
+              <w:jc w:val="left"/>
+            </w:pPr>
+            <w:r/>
+            <w:r>
+              <w:rPr>
+                <w:rFonts w:ascii="Times New Roman" w:hAnsi="Times New Roman"/>
                 <w:b w:val="0"/>
                 <w:sz w:val="20"/>
               </w:rPr>
-              <w:t>Belum dijalankan</w:t>
-            </w:r>
-          </w:p>
-        </w:tc>
-        <w:tc>
-          <w:tcPr>
-            <w:tcW w:type="dxa" w:w="2068"/>
-          </w:tcPr>
-          <w:p>
-            <w:r/>
-            <w:r>
-              <w:rPr>
-                <w:rFonts w:ascii="Times New Roman" w:hAnsi="Times New Roman" w:eastAsia="Times New Roman"/>
+              <w:t>Sebagian telah diuji secara terbatas</w:t>
+            </w:r>
+          </w:p>
+        </w:tc>
+        <w:tc>
+          <w:tcPr>
+            <w:tcW w:type="dxa" w:w="4440"/>
+            <w:vAlign w:val="center"/>
+          </w:tcPr>
+          <w:p>
+            <w:pPr>
+              <w:spacing w:after="40" w:line="252" w:lineRule="auto"/>
+              <w:jc w:val="left"/>
+            </w:pPr>
+            <w:r/>
+            <w:r>
+              <w:rPr>
+                <w:rFonts w:ascii="Times New Roman" w:hAnsi="Times New Roman"/>
                 <w:b w:val="0"/>
                 <w:sz w:val="20"/>
               </w:rPr>
-              <w:t>State keranjang, stok, transaksi, rollback gagal</w:t>
+              <w:t>Isi bukti final: katalog, state keranjang, validasi stok, transaksi berhasil/gagal, dan rollback jika checkout gagal.</w:t>
             </w:r>
           </w:p>
         </w:tc>
@@ -7325,13 +7401,18 @@
       <w:tr>
         <w:tc>
           <w:tcPr>
-            <w:tcW w:type="dxa" w:w="2068"/>
-          </w:tcPr>
-          <w:p>
-            <w:r/>
-            <w:r>
-              <w:rPr>
-                <w:rFonts w:ascii="Times New Roman" w:hAnsi="Times New Roman" w:eastAsia="Times New Roman"/>
+            <w:tcW w:type="dxa" w:w="1700"/>
+            <w:vAlign w:val="center"/>
+          </w:tcPr>
+          <w:p>
+            <w:pPr>
+              <w:spacing w:after="40" w:line="252" w:lineRule="auto"/>
+              <w:jc w:val="left"/>
+            </w:pPr>
+            <w:r/>
+            <w:r>
+              <w:rPr>
+                <w:rFonts w:ascii="Times New Roman" w:hAnsi="Times New Roman"/>
                 <w:b w:val="0"/>
                 <w:sz w:val="20"/>
               </w:rPr>
@@ -7341,49 +7422,64 @@
         </w:tc>
         <w:tc>
           <w:tcPr>
-            <w:tcW w:type="dxa" w:w="2068"/>
-          </w:tcPr>
-          <w:p>
-            <w:r/>
-            <w:r>
-              <w:rPr>
-                <w:rFonts w:ascii="Times New Roman" w:hAnsi="Times New Roman" w:eastAsia="Times New Roman"/>
+            <w:tcW w:type="dxa" w:w="1200"/>
+            <w:vAlign w:val="center"/>
+          </w:tcPr>
+          <w:p>
+            <w:pPr>
+              <w:spacing w:after="40" w:line="252" w:lineRule="auto"/>
+              <w:jc w:val="left"/>
+            </w:pPr>
+            <w:r/>
+            <w:r>
+              <w:rPr>
+                <w:rFonts w:ascii="Times New Roman" w:hAnsi="Times New Roman"/>
                 <w:b w:val="0"/>
                 <w:sz w:val="20"/>
               </w:rPr>
-              <w:t>BB-05–BB-08</w:t>
-            </w:r>
-          </w:p>
-        </w:tc>
-        <w:tc>
-          <w:tcPr>
-            <w:tcW w:type="dxa" w:w="2068"/>
-          </w:tcPr>
-          <w:p>
-            <w:r/>
-            <w:r>
-              <w:rPr>
-                <w:rFonts w:ascii="Times New Roman" w:hAnsi="Times New Roman" w:eastAsia="Times New Roman"/>
+              <w:t>BB-05-BB-08</w:t>
+            </w:r>
+          </w:p>
+        </w:tc>
+        <w:tc>
+          <w:tcPr>
+            <w:tcW w:type="dxa" w:w="1900"/>
+            <w:vAlign w:val="center"/>
+          </w:tcPr>
+          <w:p>
+            <w:pPr>
+              <w:spacing w:after="40" w:line="252" w:lineRule="auto"/>
+              <w:jc w:val="left"/>
+            </w:pPr>
+            <w:r/>
+            <w:r>
+              <w:rPr>
+                <w:rFonts w:ascii="Times New Roman" w:hAnsi="Times New Roman"/>
                 <w:b w:val="0"/>
                 <w:sz w:val="20"/>
               </w:rPr>
-              <w:t>Sebagian dicakup tes kode</w:t>
-            </w:r>
-          </w:p>
-        </w:tc>
-        <w:tc>
-          <w:tcPr>
-            <w:tcW w:type="dxa" w:w="2068"/>
-          </w:tcPr>
-          <w:p>
-            <w:r/>
-            <w:r>
-              <w:rPr>
-                <w:rFonts w:ascii="Times New Roman" w:hAnsi="Times New Roman" w:eastAsia="Times New Roman"/>
+              <w:t>Sebagian dicakup tes kode dan uji halaman</w:t>
+            </w:r>
+          </w:p>
+        </w:tc>
+        <w:tc>
+          <w:tcPr>
+            <w:tcW w:type="dxa" w:w="4440"/>
+            <w:vAlign w:val="center"/>
+          </w:tcPr>
+          <w:p>
+            <w:pPr>
+              <w:spacing w:after="40" w:line="252" w:lineRule="auto"/>
+              <w:jc w:val="left"/>
+            </w:pPr>
+            <w:r/>
+            <w:r>
+              <w:rPr>
+                <w:rFonts w:ascii="Times New Roman" w:hAnsi="Times New Roman"/>
                 <w:b w:val="0"/>
                 <w:sz w:val="20"/>
               </w:rPr>
-              <w:t>Halaman/API user berriwayat, cold start, stok habis, duplikasi ulasan</w:t>
+              <w:t>Isi bukti final: rekomendasi user berriwayat, cold start, produk stok habis, validasi duplikasi ulasan, serta screenshot/API response.</w:t>
             </w:r>
           </w:p>
         </w:tc>
@@ -7391,13 +7487,18 @@
       <w:tr>
         <w:tc>
           <w:tcPr>
-            <w:tcW w:type="dxa" w:w="2068"/>
-          </w:tcPr>
-          <w:p>
-            <w:r/>
-            <w:r>
-              <w:rPr>
-                <w:rFonts w:ascii="Times New Roman" w:hAnsi="Times New Roman" w:eastAsia="Times New Roman"/>
+            <w:tcW w:type="dxa" w:w="1700"/>
+            <w:vAlign w:val="center"/>
+          </w:tcPr>
+          <w:p>
+            <w:pPr>
+              <w:spacing w:after="40" w:line="252" w:lineRule="auto"/>
+              <w:jc w:val="left"/>
+            </w:pPr>
+            <w:r/>
+            <w:r>
+              <w:rPr>
+                <w:rFonts w:ascii="Times New Roman" w:hAnsi="Times New Roman"/>
                 <w:b w:val="0"/>
                 <w:sz w:val="20"/>
               </w:rPr>
@@ -7407,49 +7508,64 @@
         </w:tc>
         <w:tc>
           <w:tcPr>
-            <w:tcW w:type="dxa" w:w="2068"/>
-          </w:tcPr>
-          <w:p>
-            <w:r/>
-            <w:r>
-              <w:rPr>
-                <w:rFonts w:ascii="Times New Roman" w:hAnsi="Times New Roman" w:eastAsia="Times New Roman"/>
+            <w:tcW w:type="dxa" w:w="1200"/>
+            <w:vAlign w:val="center"/>
+          </w:tcPr>
+          <w:p>
+            <w:pPr>
+              <w:spacing w:after="40" w:line="252" w:lineRule="auto"/>
+              <w:jc w:val="left"/>
+            </w:pPr>
+            <w:r/>
+            <w:r>
+              <w:rPr>
+                <w:rFonts w:ascii="Times New Roman" w:hAnsi="Times New Roman"/>
                 <w:b w:val="0"/>
                 <w:sz w:val="20"/>
               </w:rPr>
-              <w:t>BB-09–BB-12</w:t>
-            </w:r>
-          </w:p>
-        </w:tc>
-        <w:tc>
-          <w:tcPr>
-            <w:tcW w:type="dxa" w:w="2068"/>
-          </w:tcPr>
-          <w:p>
-            <w:r/>
-            <w:r>
-              <w:rPr>
-                <w:rFonts w:ascii="Times New Roman" w:hAnsi="Times New Roman" w:eastAsia="Times New Roman"/>
+              <w:t>BB-09-BB-12</w:t>
+            </w:r>
+          </w:p>
+        </w:tc>
+        <w:tc>
+          <w:tcPr>
+            <w:tcW w:type="dxa" w:w="1900"/>
+            <w:vAlign w:val="center"/>
+          </w:tcPr>
+          <w:p>
+            <w:pPr>
+              <w:spacing w:after="40" w:line="252" w:lineRule="auto"/>
+              <w:jc w:val="left"/>
+            </w:pPr>
+            <w:r/>
+            <w:r>
+              <w:rPr>
+                <w:rFonts w:ascii="Times New Roman" w:hAnsi="Times New Roman"/>
                 <w:b w:val="0"/>
                 <w:sz w:val="20"/>
               </w:rPr>
-              <w:t>Belum dijalankan</w:t>
-            </w:r>
-          </w:p>
-        </w:tc>
-        <w:tc>
-          <w:tcPr>
-            <w:tcW w:type="dxa" w:w="2068"/>
-          </w:tcPr>
-          <w:p>
-            <w:r/>
-            <w:r>
-              <w:rPr>
-                <w:rFonts w:ascii="Times New Roman" w:hAnsi="Times New Roman" w:eastAsia="Times New Roman"/>
+              <w:t>Sebagian telah diuji secara terbatas</w:t>
+            </w:r>
+          </w:p>
+        </w:tc>
+        <w:tc>
+          <w:tcPr>
+            <w:tcW w:type="dxa" w:w="4440"/>
+            <w:vAlign w:val="center"/>
+          </w:tcPr>
+          <w:p>
+            <w:pPr>
+              <w:spacing w:after="40" w:line="252" w:lineRule="auto"/>
+              <w:jc w:val="left"/>
+            </w:pPr>
+            <w:r/>
+            <w:r>
+              <w:rPr>
+                <w:rFonts w:ascii="Times New Roman" w:hAnsi="Times New Roman"/>
                 <w:b w:val="0"/>
                 <w:sz w:val="20"/>
               </w:rPr>
-              <w:t>CRUD, validasi file, hash duplikat, progress pipeline, upload_logs</w:t>
+              <w:t>Isi bukti final: CRUD produk, validasi file upload, hash duplikat, progress pipeline, dan catatan upload_logs.</w:t>
             </w:r>
           </w:p>
         </w:tc>
@@ -7457,13 +7573,18 @@
       <w:tr>
         <w:tc>
           <w:tcPr>
-            <w:tcW w:type="dxa" w:w="2068"/>
-          </w:tcPr>
-          <w:p>
-            <w:r/>
-            <w:r>
-              <w:rPr>
-                <w:rFonts w:ascii="Times New Roman" w:hAnsi="Times New Roman" w:eastAsia="Times New Roman"/>
+            <w:tcW w:type="dxa" w:w="1700"/>
+            <w:vAlign w:val="center"/>
+          </w:tcPr>
+          <w:p>
+            <w:pPr>
+              <w:spacing w:after="40" w:line="252" w:lineRule="auto"/>
+              <w:jc w:val="left"/>
+            </w:pPr>
+            <w:r/>
+            <w:r>
+              <w:rPr>
+                <w:rFonts w:ascii="Times New Roman" w:hAnsi="Times New Roman"/>
                 <w:b w:val="0"/>
                 <w:sz w:val="20"/>
               </w:rPr>
@@ -7473,29 +7594,39 @@
         </w:tc>
         <w:tc>
           <w:tcPr>
-            <w:tcW w:type="dxa" w:w="2068"/>
-          </w:tcPr>
-          <w:p>
-            <w:r/>
-            <w:r>
-              <w:rPr>
-                <w:rFonts w:ascii="Times New Roman" w:hAnsi="Times New Roman" w:eastAsia="Times New Roman"/>
+            <w:tcW w:type="dxa" w:w="1200"/>
+            <w:vAlign w:val="center"/>
+          </w:tcPr>
+          <w:p>
+            <w:pPr>
+              <w:spacing w:after="40" w:line="252" w:lineRule="auto"/>
+              <w:jc w:val="left"/>
+            </w:pPr>
+            <w:r/>
+            <w:r>
+              <w:rPr>
+                <w:rFonts w:ascii="Times New Roman" w:hAnsi="Times New Roman"/>
                 <w:b w:val="0"/>
                 <w:sz w:val="20"/>
               </w:rPr>
-              <w:t>BB-13–BB-14</w:t>
-            </w:r>
-          </w:p>
-        </w:tc>
-        <w:tc>
-          <w:tcPr>
-            <w:tcW w:type="dxa" w:w="2068"/>
-          </w:tcPr>
-          <w:p>
-            <w:r/>
-            <w:r>
-              <w:rPr>
-                <w:rFonts w:ascii="Times New Roman" w:hAnsi="Times New Roman" w:eastAsia="Times New Roman"/>
+              <w:t>BB-13-BB-14</w:t>
+            </w:r>
+          </w:p>
+        </w:tc>
+        <w:tc>
+          <w:tcPr>
+            <w:tcW w:type="dxa" w:w="1900"/>
+            <w:vAlign w:val="center"/>
+          </w:tcPr>
+          <w:p>
+            <w:pPr>
+              <w:spacing w:after="40" w:line="252" w:lineRule="auto"/>
+              <w:jc w:val="left"/>
+            </w:pPr>
+            <w:r/>
+            <w:r>
+              <w:rPr>
+                <w:rFonts w:ascii="Times New Roman" w:hAnsi="Times New Roman"/>
                 <w:b w:val="0"/>
                 <w:sz w:val="20"/>
               </w:rPr>
@@ -7505,17 +7636,22 @@
         </w:tc>
         <w:tc>
           <w:tcPr>
-            <w:tcW w:type="dxa" w:w="2068"/>
-          </w:tcPr>
-          <w:p>
-            <w:r/>
-            <w:r>
-              <w:rPr>
-                <w:rFonts w:ascii="Times New Roman" w:hAnsi="Times New Roman" w:eastAsia="Times New Roman"/>
+            <w:tcW w:type="dxa" w:w="4440"/>
+            <w:vAlign w:val="center"/>
+          </w:tcPr>
+          <w:p>
+            <w:pPr>
+              <w:spacing w:after="40" w:line="252" w:lineRule="auto"/>
+              <w:jc w:val="left"/>
+            </w:pPr>
+            <w:r/>
+            <w:r>
+              <w:rPr>
+                <w:rFonts w:ascii="Times New Roman" w:hAnsi="Times New Roman"/>
                 <w:b w:val="0"/>
                 <w:sz w:val="20"/>
               </w:rPr>
-              <w:t>Transisi status; order sandbox; signature; idempotensi</w:t>
+              <w:t>Isi bukti final: transisi status pesanan, pembayaran sandbox, signature webhook, dan idempotensi callback.</w:t>
             </w:r>
           </w:p>
         </w:tc>
@@ -7542,11 +7678,10 @@
       </w:pPr>
       <w:r>
         <w:rPr>
-          <w:rFonts w:ascii="Times New Roman" w:hAnsi="Times New Roman" w:eastAsia="Times New Roman"/>
-          <w:b w:val="0"/>
-          <w:sz w:val="22"/>
+          <w:rFonts w:ascii="Times New Roman" w:hAnsi="Times New Roman"/>
+          <w:sz w:val="24"/>
         </w:rPr>
-        <w:t>Arsip proyek menyediakan matriks keterlacakan dan skenario UAT, tetapi tidak memuat berita acara, record eksekusi, tangkapan layar, daftar temuan, atau jawaban SUS. Oleh karena itu penerimaan pengguna dan skor usability belum dapat dinyatakan.</w:t>
+        <w:t>Tabel berikut digunakan untuk membedakan uji yang sudah dibuktikan secara teknis dengan UAT, SUS, kompatibilitas, performa, dan keamanan baseline yang masih memerlukan bukti responden atau eksekusi khusus.</w:t>
       </w:r>
     </w:p>
     <w:p>
@@ -7565,25 +7700,44 @@
     <w:tbl>
       <w:tblPr>
         <w:tblStyle w:val="TableGrid"/>
-        <w:tblW w:type="auto" w:w="0"/>
+        <w:tblW w:type="dxa" w:w="9240"/>
+        <w:tblLayout w:type="fixed"/>
         <w:tblLook w:firstColumn="1" w:firstRow="1" w:lastColumn="0" w:lastRow="0" w:noHBand="0" w:noVBand="1" w:val="04A0"/>
+        <w:tblBorders>
+          <w:top w:val="single" w:sz="6" w:space="0" w:color="808080"/>
+          <w:left w:val="single" w:sz="6" w:space="0" w:color="808080"/>
+          <w:bottom w:val="single" w:sz="6" w:space="0" w:color="808080"/>
+          <w:right w:val="single" w:sz="6" w:space="0" w:color="808080"/>
+          <w:insideH w:val="single" w:sz="6" w:space="0" w:color="808080"/>
+          <w:insideV w:val="single" w:sz="6" w:space="0" w:color="808080"/>
+        </w:tblBorders>
+        <w:tblInd w:w="120" w:type="dxa"/>
       </w:tblPr>
       <w:tblGrid>
-        <w:gridCol w:w="2068"/>
-        <w:gridCol w:w="2068"/>
-        <w:gridCol w:w="2068"/>
-        <w:gridCol w:w="2068"/>
+        <w:gridCol w:w="1600"/>
+        <w:gridCol w:w="1900"/>
+        <w:gridCol w:w="2200"/>
+        <w:gridCol w:w="3540"/>
       </w:tblGrid>
       <w:tr>
-        <w:tc>
-          <w:tcPr>
-            <w:tcW w:type="dxa" w:w="2068"/>
-          </w:tcPr>
-          <w:p>
-            <w:r/>
-            <w:r>
-              <w:rPr>
-                <w:rFonts w:ascii="Times New Roman" w:hAnsi="Times New Roman" w:eastAsia="Times New Roman"/>
+        <w:trPr>
+          <w:tblHeader w:val="true"/>
+        </w:trPr>
+        <w:tc>
+          <w:tcPr>
+            <w:tcW w:type="dxa" w:w="1600"/>
+            <w:vAlign w:val="center"/>
+            <w:shd w:fill="D9EAF7"/>
+          </w:tcPr>
+          <w:p>
+            <w:pPr>
+              <w:spacing w:after="40" w:line="252" w:lineRule="auto"/>
+              <w:jc w:val="center"/>
+            </w:pPr>
+            <w:r/>
+            <w:r>
+              <w:rPr>
+                <w:rFonts w:ascii="Times New Roman" w:hAnsi="Times New Roman"/>
                 <w:b/>
                 <w:sz w:val="20"/>
               </w:rPr>
@@ -7593,13 +7747,19 @@
         </w:tc>
         <w:tc>
           <w:tcPr>
-            <w:tcW w:type="dxa" w:w="2068"/>
-          </w:tcPr>
-          <w:p>
-            <w:r/>
-            <w:r>
-              <w:rPr>
-                <w:rFonts w:ascii="Times New Roman" w:hAnsi="Times New Roman" w:eastAsia="Times New Roman"/>
+            <w:tcW w:type="dxa" w:w="1900"/>
+            <w:vAlign w:val="center"/>
+            <w:shd w:fill="D9EAF7"/>
+          </w:tcPr>
+          <w:p>
+            <w:pPr>
+              <w:spacing w:after="40" w:line="252" w:lineRule="auto"/>
+              <w:jc w:val="center"/>
+            </w:pPr>
+            <w:r/>
+            <w:r>
+              <w:rPr>
+                <w:rFonts w:ascii="Times New Roman" w:hAnsi="Times New Roman"/>
                 <w:b/>
                 <w:sz w:val="20"/>
               </w:rPr>
@@ -7609,13 +7769,19 @@
         </w:tc>
         <w:tc>
           <w:tcPr>
-            <w:tcW w:type="dxa" w:w="2068"/>
-          </w:tcPr>
-          <w:p>
-            <w:r/>
-            <w:r>
-              <w:rPr>
-                <w:rFonts w:ascii="Times New Roman" w:hAnsi="Times New Roman" w:eastAsia="Times New Roman"/>
+            <w:tcW w:type="dxa" w:w="2200"/>
+            <w:vAlign w:val="center"/>
+            <w:shd w:fill="D9EAF7"/>
+          </w:tcPr>
+          <w:p>
+            <w:pPr>
+              <w:spacing w:after="40" w:line="252" w:lineRule="auto"/>
+              <w:jc w:val="center"/>
+            </w:pPr>
+            <w:r/>
+            <w:r>
+              <w:rPr>
+                <w:rFonts w:ascii="Times New Roman" w:hAnsi="Times New Roman"/>
                 <w:b/>
                 <w:sz w:val="20"/>
               </w:rPr>
@@ -7625,17 +7791,23 @@
         </w:tc>
         <w:tc>
           <w:tcPr>
-            <w:tcW w:type="dxa" w:w="2068"/>
-          </w:tcPr>
-          <w:p>
-            <w:r/>
-            <w:r>
-              <w:rPr>
-                <w:rFonts w:ascii="Times New Roman" w:hAnsi="Times New Roman" w:eastAsia="Times New Roman"/>
+            <w:tcW w:type="dxa" w:w="3540"/>
+            <w:vAlign w:val="center"/>
+            <w:shd w:fill="D9EAF7"/>
+          </w:tcPr>
+          <w:p>
+            <w:pPr>
+              <w:spacing w:after="40" w:line="252" w:lineRule="auto"/>
+              <w:jc w:val="center"/>
+            </w:pPr>
+            <w:r/>
+            <w:r>
+              <w:rPr>
+                <w:rFonts w:ascii="Times New Roman" w:hAnsi="Times New Roman"/>
                 <w:b/>
                 <w:sz w:val="20"/>
               </w:rPr>
-              <w:t>Keputusan saat ini</w:t>
+              <w:t>Isian Hasil/Keputusan</w:t>
             </w:r>
           </w:p>
         </w:tc>
@@ -7643,13 +7815,18 @@
       <w:tr>
         <w:tc>
           <w:tcPr>
-            <w:tcW w:type="dxa" w:w="2068"/>
-          </w:tcPr>
-          <w:p>
-            <w:r/>
-            <w:r>
-              <w:rPr>
-                <w:rFonts w:ascii="Times New Roman" w:hAnsi="Times New Roman" w:eastAsia="Times New Roman"/>
+            <w:tcW w:type="dxa" w:w="1600"/>
+            <w:vAlign w:val="center"/>
+          </w:tcPr>
+          <w:p>
+            <w:pPr>
+              <w:spacing w:after="40" w:line="252" w:lineRule="auto"/>
+              <w:jc w:val="left"/>
+            </w:pPr>
+            <w:r/>
+            <w:r>
+              <w:rPr>
+                <w:rFonts w:ascii="Times New Roman" w:hAnsi="Times New Roman"/>
                 <w:b w:val="0"/>
                 <w:sz w:val="20"/>
               </w:rPr>
@@ -7659,49 +7836,64 @@
         </w:tc>
         <w:tc>
           <w:tcPr>
-            <w:tcW w:type="dxa" w:w="2068"/>
-          </w:tcPr>
-          <w:p>
-            <w:r/>
-            <w:r>
-              <w:rPr>
-                <w:rFonts w:ascii="Times New Roman" w:hAnsi="Times New Roman" w:eastAsia="Times New Roman"/>
+            <w:tcW w:type="dxa" w:w="1900"/>
+            <w:vAlign w:val="center"/>
+          </w:tcPr>
+          <w:p>
+            <w:pPr>
+              <w:spacing w:after="40" w:line="252" w:lineRule="auto"/>
+              <w:jc w:val="left"/>
+            </w:pPr>
+            <w:r/>
+            <w:r>
+              <w:rPr>
+                <w:rFonts w:ascii="Times New Roman" w:hAnsi="Times New Roman"/>
                 <w:b w:val="0"/>
                 <w:sz w:val="20"/>
               </w:rPr>
-              <w:t>Skenario P-01–P-18</w:t>
-            </w:r>
-          </w:p>
-        </w:tc>
-        <w:tc>
-          <w:tcPr>
-            <w:tcW w:type="dxa" w:w="2068"/>
-          </w:tcPr>
-          <w:p>
-            <w:r/>
-            <w:r>
-              <w:rPr>
-                <w:rFonts w:ascii="Times New Roman" w:hAnsi="Times New Roman" w:eastAsia="Times New Roman"/>
+              <w:t>Skenario P-01-P-18</w:t>
+            </w:r>
+          </w:p>
+        </w:tc>
+        <w:tc>
+          <w:tcPr>
+            <w:tcW w:type="dxa" w:w="2200"/>
+            <w:vAlign w:val="center"/>
+          </w:tcPr>
+          <w:p>
+            <w:pPr>
+              <w:spacing w:after="40" w:line="252" w:lineRule="auto"/>
+              <w:jc w:val="left"/>
+            </w:pPr>
+            <w:r/>
+            <w:r>
+              <w:rPr>
+                <w:rFonts w:ascii="Times New Roman" w:hAnsi="Times New Roman"/>
                 <w:b w:val="0"/>
                 <w:sz w:val="20"/>
               </w:rPr>
-              <w:t>Belum dilaksanakan</w:t>
-            </w:r>
-          </w:p>
-        </w:tc>
-        <w:tc>
-          <w:tcPr>
-            <w:tcW w:type="dxa" w:w="2068"/>
-          </w:tcPr>
-          <w:p>
-            <w:r/>
-            <w:r>
-              <w:rPr>
-                <w:rFonts w:ascii="Times New Roman" w:hAnsi="Times New Roman" w:eastAsia="Times New Roman"/>
+              <w:t>Belum dilaksanakan oleh responden pelanggan</w:t>
+            </w:r>
+          </w:p>
+        </w:tc>
+        <w:tc>
+          <w:tcPr>
+            <w:tcW w:type="dxa" w:w="3540"/>
+            <w:vAlign w:val="center"/>
+          </w:tcPr>
+          <w:p>
+            <w:pPr>
+              <w:spacing w:after="40" w:line="252" w:lineRule="auto"/>
+              <w:jc w:val="left"/>
+            </w:pPr>
+            <w:r/>
+            <w:r>
+              <w:rPr>
+                <w:rFonts w:ascii="Times New Roman" w:hAnsi="Times New Roman"/>
                 <w:b w:val="0"/>
                 <w:sz w:val="20"/>
               </w:rPr>
-              <w:t>Penerimaan pelanggan belum terbukti</w:t>
+              <w:t>Isi setelah UAT: jumlah responden, tanggal pelaksanaan, ringkasan skenario lulus/gagal, temuan, dan keputusan penerimaan pelanggan.</w:t>
             </w:r>
           </w:p>
         </w:tc>
@@ -7709,13 +7901,18 @@
       <w:tr>
         <w:tc>
           <w:tcPr>
-            <w:tcW w:type="dxa" w:w="2068"/>
-          </w:tcPr>
-          <w:p>
-            <w:r/>
-            <w:r>
-              <w:rPr>
-                <w:rFonts w:ascii="Times New Roman" w:hAnsi="Times New Roman" w:eastAsia="Times New Roman"/>
+            <w:tcW w:type="dxa" w:w="1600"/>
+            <w:vAlign w:val="center"/>
+          </w:tcPr>
+          <w:p>
+            <w:pPr>
+              <w:spacing w:after="40" w:line="252" w:lineRule="auto"/>
+              <w:jc w:val="left"/>
+            </w:pPr>
+            <w:r/>
+            <w:r>
+              <w:rPr>
+                <w:rFonts w:ascii="Times New Roman" w:hAnsi="Times New Roman"/>
                 <w:b w:val="0"/>
                 <w:sz w:val="20"/>
               </w:rPr>
@@ -7725,49 +7922,64 @@
         </w:tc>
         <w:tc>
           <w:tcPr>
-            <w:tcW w:type="dxa" w:w="2068"/>
-          </w:tcPr>
-          <w:p>
-            <w:r/>
-            <w:r>
-              <w:rPr>
-                <w:rFonts w:ascii="Times New Roman" w:hAnsi="Times New Roman" w:eastAsia="Times New Roman"/>
+            <w:tcW w:type="dxa" w:w="1900"/>
+            <w:vAlign w:val="center"/>
+          </w:tcPr>
+          <w:p>
+            <w:pPr>
+              <w:spacing w:after="40" w:line="252" w:lineRule="auto"/>
+              <w:jc w:val="left"/>
+            </w:pPr>
+            <w:r/>
+            <w:r>
+              <w:rPr>
+                <w:rFonts w:ascii="Times New Roman" w:hAnsi="Times New Roman"/>
                 <w:b w:val="0"/>
                 <w:sz w:val="20"/>
               </w:rPr>
-              <w:t>Skenario A-01–A-14</w:t>
-            </w:r>
-          </w:p>
-        </w:tc>
-        <w:tc>
-          <w:tcPr>
-            <w:tcW w:type="dxa" w:w="2068"/>
-          </w:tcPr>
-          <w:p>
-            <w:r/>
-            <w:r>
-              <w:rPr>
-                <w:rFonts w:ascii="Times New Roman" w:hAnsi="Times New Roman" w:eastAsia="Times New Roman"/>
+              <w:t>Skenario A-01-A-14</w:t>
+            </w:r>
+          </w:p>
+        </w:tc>
+        <w:tc>
+          <w:tcPr>
+            <w:tcW w:type="dxa" w:w="2200"/>
+            <w:vAlign w:val="center"/>
+          </w:tcPr>
+          <w:p>
+            <w:pPr>
+              <w:spacing w:after="40" w:line="252" w:lineRule="auto"/>
+              <w:jc w:val="left"/>
+            </w:pPr>
+            <w:r/>
+            <w:r>
+              <w:rPr>
+                <w:rFonts w:ascii="Times New Roman" w:hAnsi="Times New Roman"/>
                 <w:b w:val="0"/>
                 <w:sz w:val="20"/>
               </w:rPr>
-              <w:t>Belum dilaksanakan</w:t>
-            </w:r>
-          </w:p>
-        </w:tc>
-        <w:tc>
-          <w:tcPr>
-            <w:tcW w:type="dxa" w:w="2068"/>
-          </w:tcPr>
-          <w:p>
-            <w:r/>
-            <w:r>
-              <w:rPr>
-                <w:rFonts w:ascii="Times New Roman" w:hAnsi="Times New Roman" w:eastAsia="Times New Roman"/>
+              <w:t>Belum dilaksanakan oleh responden administrator</w:t>
+            </w:r>
+          </w:p>
+        </w:tc>
+        <w:tc>
+          <w:tcPr>
+            <w:tcW w:type="dxa" w:w="3540"/>
+            <w:vAlign w:val="center"/>
+          </w:tcPr>
+          <w:p>
+            <w:pPr>
+              <w:spacing w:after="40" w:line="252" w:lineRule="auto"/>
+              <w:jc w:val="left"/>
+            </w:pPr>
+            <w:r/>
+            <w:r>
+              <w:rPr>
+                <w:rFonts w:ascii="Times New Roman" w:hAnsi="Times New Roman"/>
                 <w:b w:val="0"/>
                 <w:sz w:val="20"/>
               </w:rPr>
-              <w:t>Kesiapan operasional admin belum terbukti</w:t>
+              <w:t>Isi setelah UAT: identitas/peran responden admin, skenario yang dijalankan, temuan, dan keputusan kesiapan operasional admin.</w:t>
             </w:r>
           </w:p>
         </w:tc>
@@ -7775,13 +7987,18 @@
       <w:tr>
         <w:tc>
           <w:tcPr>
-            <w:tcW w:type="dxa" w:w="2068"/>
-          </w:tcPr>
-          <w:p>
-            <w:r/>
-            <w:r>
-              <w:rPr>
-                <w:rFonts w:ascii="Times New Roman" w:hAnsi="Times New Roman" w:eastAsia="Times New Roman"/>
+            <w:tcW w:type="dxa" w:w="1600"/>
+            <w:vAlign w:val="center"/>
+          </w:tcPr>
+          <w:p>
+            <w:pPr>
+              <w:spacing w:after="40" w:line="252" w:lineRule="auto"/>
+              <w:jc w:val="left"/>
+            </w:pPr>
+            <w:r/>
+            <w:r>
+              <w:rPr>
+                <w:rFonts w:ascii="Times New Roman" w:hAnsi="Times New Roman"/>
                 <w:b w:val="0"/>
                 <w:sz w:val="20"/>
               </w:rPr>
@@ -7791,49 +8008,64 @@
         </w:tc>
         <w:tc>
           <w:tcPr>
-            <w:tcW w:type="dxa" w:w="2068"/>
-          </w:tcPr>
-          <w:p>
-            <w:r/>
-            <w:r>
-              <w:rPr>
-                <w:rFonts w:ascii="Times New Roman" w:hAnsi="Times New Roman" w:eastAsia="Times New Roman"/>
+            <w:tcW w:type="dxa" w:w="1900"/>
+            <w:vAlign w:val="center"/>
+          </w:tcPr>
+          <w:p>
+            <w:pPr>
+              <w:spacing w:after="40" w:line="252" w:lineRule="auto"/>
+              <w:jc w:val="left"/>
+            </w:pPr>
+            <w:r/>
+            <w:r>
+              <w:rPr>
+                <w:rFonts w:ascii="Times New Roman" w:hAnsi="Times New Roman"/>
                 <w:b w:val="0"/>
                 <w:sz w:val="20"/>
               </w:rPr>
-              <w:t>10 item; skor 0–100</w:t>
-            </w:r>
-          </w:p>
-        </w:tc>
-        <w:tc>
-          <w:tcPr>
-            <w:tcW w:type="dxa" w:w="2068"/>
-          </w:tcPr>
-          <w:p>
-            <w:r/>
-            <w:r>
-              <w:rPr>
-                <w:rFonts w:ascii="Times New Roman" w:hAnsi="Times New Roman" w:eastAsia="Times New Roman"/>
+              <w:t>10 item skala 1-5; skor 0-100</w:t>
+            </w:r>
+          </w:p>
+        </w:tc>
+        <w:tc>
+          <w:tcPr>
+            <w:tcW w:type="dxa" w:w="2200"/>
+            <w:vAlign w:val="center"/>
+          </w:tcPr>
+          <w:p>
+            <w:pPr>
+              <w:spacing w:after="40" w:line="252" w:lineRule="auto"/>
+              <w:jc w:val="left"/>
+            </w:pPr>
+            <w:r/>
+            <w:r>
+              <w:rPr>
+                <w:rFonts w:ascii="Times New Roman" w:hAnsi="Times New Roman"/>
                 <w:b w:val="0"/>
                 <w:sz w:val="20"/>
               </w:rPr>
-              <w:t>Belum ada respons</w:t>
-            </w:r>
-          </w:p>
-        </w:tc>
-        <w:tc>
-          <w:tcPr>
-            <w:tcW w:type="dxa" w:w="2068"/>
-          </w:tcPr>
-          <w:p>
-            <w:r/>
-            <w:r>
-              <w:rPr>
-                <w:rFonts w:ascii="Times New Roman" w:hAnsi="Times New Roman" w:eastAsia="Times New Roman"/>
+              <w:t>Belum ada respons kuesioner</w:t>
+            </w:r>
+          </w:p>
+        </w:tc>
+        <w:tc>
+          <w:tcPr>
+            <w:tcW w:type="dxa" w:w="3540"/>
+            <w:vAlign w:val="center"/>
+          </w:tcPr>
+          <w:p>
+            <w:pPr>
+              <w:spacing w:after="40" w:line="252" w:lineRule="auto"/>
+              <w:jc w:val="left"/>
+            </w:pPr>
+            <w:r/>
+            <w:r>
+              <w:rPr>
+                <w:rFonts w:ascii="Times New Roman" w:hAnsi="Times New Roman"/>
                 <w:b w:val="0"/>
                 <w:sz w:val="20"/>
               </w:rPr>
-              <w:t>Skor usability tidak dapat dihitung</w:t>
+              <w:t>Isi setelah kuesioner: jumlah responden pelanggan dan admin, skor per responden, rata-rata SUS, interpretasi, dan lampiran Google Form/rekap jawaban.</w:t>
             </w:r>
           </w:p>
         </w:tc>
@@ -7841,13 +8073,18 @@
       <w:tr>
         <w:tc>
           <w:tcPr>
-            <w:tcW w:type="dxa" w:w="2068"/>
-          </w:tcPr>
-          <w:p>
-            <w:r/>
-            <w:r>
-              <w:rPr>
-                <w:rFonts w:ascii="Times New Roman" w:hAnsi="Times New Roman" w:eastAsia="Times New Roman"/>
+            <w:tcW w:type="dxa" w:w="1600"/>
+            <w:vAlign w:val="center"/>
+          </w:tcPr>
+          <w:p>
+            <w:pPr>
+              <w:spacing w:after="40" w:line="252" w:lineRule="auto"/>
+              <w:jc w:val="left"/>
+            </w:pPr>
+            <w:r/>
+            <w:r>
+              <w:rPr>
+                <w:rFonts w:ascii="Times New Roman" w:hAnsi="Times New Roman"/>
                 <w:b w:val="0"/>
                 <w:sz w:val="20"/>
               </w:rPr>
@@ -7857,49 +8094,64 @@
         </w:tc>
         <w:tc>
           <w:tcPr>
-            <w:tcW w:type="dxa" w:w="2068"/>
-          </w:tcPr>
-          <w:p>
-            <w:r/>
-            <w:r>
-              <w:rPr>
-                <w:rFonts w:ascii="Times New Roman" w:hAnsi="Times New Roman" w:eastAsia="Times New Roman"/>
+            <w:tcW w:type="dxa" w:w="1900"/>
+            <w:vAlign w:val="center"/>
+          </w:tcPr>
+          <w:p>
+            <w:pPr>
+              <w:spacing w:after="40" w:line="252" w:lineRule="auto"/>
+              <w:jc w:val="left"/>
+            </w:pPr>
+            <w:r/>
+            <w:r>
+              <w:rPr>
+                <w:rFonts w:ascii="Times New Roman" w:hAnsi="Times New Roman"/>
                 <w:b w:val="0"/>
                 <w:sz w:val="20"/>
               </w:rPr>
-              <w:t>Desktop/mobile</w:t>
-            </w:r>
-          </w:p>
-        </w:tc>
-        <w:tc>
-          <w:tcPr>
-            <w:tcW w:type="dxa" w:w="2068"/>
-          </w:tcPr>
-          <w:p>
-            <w:r/>
-            <w:r>
-              <w:rPr>
-                <w:rFonts w:ascii="Times New Roman" w:hAnsi="Times New Roman" w:eastAsia="Times New Roman"/>
+              <w:t>Desktop, mobile, dan lintas-peramban</w:t>
+            </w:r>
+          </w:p>
+        </w:tc>
+        <w:tc>
+          <w:tcPr>
+            <w:tcW w:type="dxa" w:w="2200"/>
+            <w:vAlign w:val="center"/>
+          </w:tcPr>
+          <w:p>
+            <w:pPr>
+              <w:spacing w:after="40" w:line="252" w:lineRule="auto"/>
+              <w:jc w:val="left"/>
+            </w:pPr>
+            <w:r/>
+            <w:r>
+              <w:rPr>
+                <w:rFonts w:ascii="Times New Roman" w:hAnsi="Times New Roman"/>
                 <w:b w:val="0"/>
                 <w:sz w:val="20"/>
               </w:rPr>
-              <w:t>Belum dilaksanakan</w:t>
-            </w:r>
-          </w:p>
-        </w:tc>
-        <w:tc>
-          <w:tcPr>
-            <w:tcW w:type="dxa" w:w="2068"/>
-          </w:tcPr>
-          <w:p>
-            <w:r/>
-            <w:r>
-              <w:rPr>
-                <w:rFonts w:ascii="Times New Roman" w:hAnsi="Times New Roman" w:eastAsia="Times New Roman"/>
+              <w:t>Pemeriksaan desktop terbatas telah dilakukan; uji mobile/lintas-peramban belum lengkap</w:t>
+            </w:r>
+          </w:p>
+        </w:tc>
+        <w:tc>
+          <w:tcPr>
+            <w:tcW w:type="dxa" w:w="3540"/>
+            <w:vAlign w:val="center"/>
+          </w:tcPr>
+          <w:p>
+            <w:pPr>
+              <w:spacing w:after="40" w:line="252" w:lineRule="auto"/>
+              <w:jc w:val="left"/>
+            </w:pPr>
+            <w:r/>
+            <w:r>
+              <w:rPr>
+                <w:rFonts w:ascii="Times New Roman" w:hAnsi="Times New Roman"/>
                 <w:b w:val="0"/>
                 <w:sz w:val="20"/>
               </w:rPr>
-              <w:t>Responsivitas belum diverifikasi</w:t>
+              <w:t>Isi hasil final: perangkat, browser, resolusi layar, halaman yang diuji, masalah tampilan, dan status responsivitas.</w:t>
             </w:r>
           </w:p>
         </w:tc>
@@ -7907,13 +8159,18 @@
       <w:tr>
         <w:tc>
           <w:tcPr>
-            <w:tcW w:type="dxa" w:w="2068"/>
-          </w:tcPr>
-          <w:p>
-            <w:r/>
-            <w:r>
-              <w:rPr>
-                <w:rFonts w:ascii="Times New Roman" w:hAnsi="Times New Roman" w:eastAsia="Times New Roman"/>
+            <w:tcW w:type="dxa" w:w="1600"/>
+            <w:vAlign w:val="center"/>
+          </w:tcPr>
+          <w:p>
+            <w:pPr>
+              <w:spacing w:after="40" w:line="252" w:lineRule="auto"/>
+              <w:jc w:val="left"/>
+            </w:pPr>
+            <w:r/>
+            <w:r>
+              <w:rPr>
+                <w:rFonts w:ascii="Times New Roman" w:hAnsi="Times New Roman"/>
                 <w:b w:val="0"/>
                 <w:sz w:val="20"/>
               </w:rPr>
@@ -7923,13 +8180,18 @@
         </w:tc>
         <w:tc>
           <w:tcPr>
-            <w:tcW w:type="dxa" w:w="2068"/>
-          </w:tcPr>
-          <w:p>
-            <w:r/>
-            <w:r>
-              <w:rPr>
-                <w:rFonts w:ascii="Times New Roman" w:hAnsi="Times New Roman" w:eastAsia="Times New Roman"/>
+            <w:tcW w:type="dxa" w:w="1900"/>
+            <w:vAlign w:val="center"/>
+          </w:tcPr>
+          <w:p>
+            <w:pPr>
+              <w:spacing w:after="40" w:line="252" w:lineRule="auto"/>
+              <w:jc w:val="left"/>
+            </w:pPr>
+            <w:r/>
+            <w:r>
+              <w:rPr>
+                <w:rFonts w:ascii="Times New Roman" w:hAnsi="Times New Roman"/>
                 <w:b w:val="0"/>
                 <w:sz w:val="20"/>
               </w:rPr>
@@ -7939,13 +8201,18 @@
         </w:tc>
         <w:tc>
           <w:tcPr>
-            <w:tcW w:type="dxa" w:w="2068"/>
-          </w:tcPr>
-          <w:p>
-            <w:r/>
-            <w:r>
-              <w:rPr>
-                <w:rFonts w:ascii="Times New Roman" w:hAnsi="Times New Roman" w:eastAsia="Times New Roman"/>
+            <w:tcW w:type="dxa" w:w="2200"/>
+            <w:vAlign w:val="center"/>
+          </w:tcPr>
+          <w:p>
+            <w:pPr>
+              <w:spacing w:after="40" w:line="252" w:lineRule="auto"/>
+              <w:jc w:val="left"/>
+            </w:pPr>
+            <w:r/>
+            <w:r>
+              <w:rPr>
+                <w:rFonts w:ascii="Times New Roman" w:hAnsi="Times New Roman"/>
                 <w:b w:val="0"/>
                 <w:sz w:val="20"/>
               </w:rPr>
@@ -7955,17 +8222,22 @@
         </w:tc>
         <w:tc>
           <w:tcPr>
-            <w:tcW w:type="dxa" w:w="2068"/>
-          </w:tcPr>
-          <w:p>
-            <w:r/>
-            <w:r>
-              <w:rPr>
-                <w:rFonts w:ascii="Times New Roman" w:hAnsi="Times New Roman" w:eastAsia="Times New Roman"/>
+            <w:tcW w:type="dxa" w:w="3540"/>
+            <w:vAlign w:val="center"/>
+          </w:tcPr>
+          <w:p>
+            <w:pPr>
+              <w:spacing w:after="40" w:line="252" w:lineRule="auto"/>
+              <w:jc w:val="left"/>
+            </w:pPr>
+            <w:r/>
+            <w:r>
+              <w:rPr>
+                <w:rFonts w:ascii="Times New Roman" w:hAnsi="Times New Roman"/>
                 <w:b w:val="0"/>
                 <w:sz w:val="20"/>
               </w:rPr>
-              <w:t>Tidak diganti benchmark evaluator Python</w:t>
+              <w:t>Isi setelah uji beban: tool, endpoint, jumlah virtual user, durasi, p50/p95, throughput, error rate, dan kesimpulan performa.</w:t>
             </w:r>
           </w:p>
         </w:tc>
@@ -7973,13 +8245,18 @@
       <w:tr>
         <w:tc>
           <w:tcPr>
-            <w:tcW w:type="dxa" w:w="2068"/>
-          </w:tcPr>
-          <w:p>
-            <w:r/>
-            <w:r>
-              <w:rPr>
-                <w:rFonts w:ascii="Times New Roman" w:hAnsi="Times New Roman" w:eastAsia="Times New Roman"/>
+            <w:tcW w:type="dxa" w:w="1600"/>
+            <w:vAlign w:val="center"/>
+          </w:tcPr>
+          <w:p>
+            <w:pPr>
+              <w:spacing w:after="40" w:line="252" w:lineRule="auto"/>
+              <w:jc w:val="left"/>
+            </w:pPr>
+            <w:r/>
+            <w:r>
+              <w:rPr>
+                <w:rFonts w:ascii="Times New Roman" w:hAnsi="Times New Roman"/>
                 <w:b w:val="0"/>
                 <w:sz w:val="20"/>
               </w:rPr>
@@ -7989,13 +8266,18 @@
         </w:tc>
         <w:tc>
           <w:tcPr>
-            <w:tcW w:type="dxa" w:w="2068"/>
-          </w:tcPr>
-          <w:p>
-            <w:r/>
-            <w:r>
-              <w:rPr>
-                <w:rFonts w:ascii="Times New Roman" w:hAnsi="Times New Roman" w:eastAsia="Times New Roman"/>
+            <w:tcW w:type="dxa" w:w="1900"/>
+            <w:vAlign w:val="center"/>
+          </w:tcPr>
+          <w:p>
+            <w:pPr>
+              <w:spacing w:after="40" w:line="252" w:lineRule="auto"/>
+              <w:jc w:val="left"/>
+            </w:pPr>
+            <w:r/>
+            <w:r>
+              <w:rPr>
+                <w:rFonts w:ascii="Times New Roman" w:hAnsi="Times New Roman"/>
                 <w:b w:val="0"/>
                 <w:sz w:val="20"/>
               </w:rPr>
@@ -8005,33 +8287,43 @@
         </w:tc>
         <w:tc>
           <w:tcPr>
-            <w:tcW w:type="dxa" w:w="2068"/>
-          </w:tcPr>
-          <w:p>
-            <w:r/>
-            <w:r>
-              <w:rPr>
-                <w:rFonts w:ascii="Times New Roman" w:hAnsi="Times New Roman" w:eastAsia="Times New Roman"/>
+            <w:tcW w:type="dxa" w:w="2200"/>
+            <w:vAlign w:val="center"/>
+          </w:tcPr>
+          <w:p>
+            <w:pPr>
+              <w:spacing w:after="40" w:line="252" w:lineRule="auto"/>
+              <w:jc w:val="left"/>
+            </w:pPr>
+            <w:r/>
+            <w:r>
+              <w:rPr>
+                <w:rFonts w:ascii="Times New Roman" w:hAnsi="Times New Roman"/>
                 <w:b w:val="0"/>
                 <w:sz w:val="20"/>
               </w:rPr>
-              <w:t>Belum dilaksanakan</w:t>
-            </w:r>
-          </w:p>
-        </w:tc>
-        <w:tc>
-          <w:tcPr>
-            <w:tcW w:type="dxa" w:w="2068"/>
-          </w:tcPr>
-          <w:p>
-            <w:r/>
-            <w:r>
-              <w:rPr>
-                <w:rFonts w:ascii="Times New Roman" w:hAnsi="Times New Roman" w:eastAsia="Times New Roman"/>
+              <w:t>Sebagian diuji: guest dialihkan dari /admin dan /checkout; cakupan lengkap belum diuji</w:t>
+            </w:r>
+          </w:p>
+        </w:tc>
+        <w:tc>
+          <w:tcPr>
+            <w:tcW w:type="dxa" w:w="3540"/>
+            <w:vAlign w:val="center"/>
+          </w:tcPr>
+          <w:p>
+            <w:pPr>
+              <w:spacing w:after="40" w:line="252" w:lineRule="auto"/>
+              <w:jc w:val="left"/>
+            </w:pPr>
+            <w:r/>
+            <w:r>
+              <w:rPr>
+                <w:rFonts w:ascii="Times New Roman" w:hAnsi="Times New Roman"/>
                 <w:b w:val="0"/>
                 <w:sz w:val="20"/>
               </w:rPr>
-              <w:t>Tidak boleh menyatakan aman dari source inspection saja</w:t>
+              <w:t>Isi bukti final: hasil pengujian role, session timeout/logout, token CSRF, validasi upload, signature webhook, dan catatan risiko tersisa.</w:t>
             </w:r>
           </w:p>
         </w:tc>

</xml_diff>